<commit_message>
Mejora de formatos: intercalado de características e imágenes y tamaño estándar sin distorsión
</commit_message>
<xml_diff>
--- a/plantillas_docx/ficha_tecnica_tpl.docx
+++ b/plantillas_docx/ficha_tecnica_tpl.docx
@@ -196,6 +196,15 @@
         </w:tc>
       </w:tr>
     </w:tbl>
+    <w:p>
+      <w:pPr/>
+      <w:r>
+        <w:rPr>
+          <w:b/>
+        </w:rPr>
+        <w:t>DENOMINACIÓN DE ADQUISICIÓN: {{ denominacion_adquisicion }}</w:t>
+      </w:r>
+    </w:p>
     <w:p>
       <w:pPr>
         <w:rPr>

</xml_diff>